<commit_message>
add customer and act
</commit_message>
<xml_diff>
--- a/templates/TransportOrderAgreement.docx
+++ b/templates/TransportOrderAgreement.docx
@@ -46,7 +46,21 @@
         <w:rPr>
           <w:b/>
         </w:rPr>
-        <w:t>{orderDate}</w:t>
+        <w:t>{</w:t>
+      </w:r>
+      <w:proofErr w:type="spellStart"/>
+      <w:r>
+        <w:rPr>
+          <w:b/>
+        </w:rPr>
+        <w:t>orderDate</w:t>
+      </w:r>
+      <w:proofErr w:type="spellEnd"/>
+      <w:r>
+        <w:rPr>
+          <w:b/>
+        </w:rPr>
+        <w:t>}</w:t>
       </w:r>
     </w:p>
     <w:p>
@@ -81,7 +95,21 @@
         <w:rPr>
           <w:b/>
         </w:rPr>
-        <w:t>{isInternational}</w:t>
+        <w:t>{</w:t>
+      </w:r>
+      <w:proofErr w:type="spellStart"/>
+      <w:r>
+        <w:rPr>
+          <w:b/>
+        </w:rPr>
+        <w:t>isInternational</w:t>
+      </w:r>
+      <w:proofErr w:type="spellEnd"/>
+      <w:r>
+        <w:rPr>
+          <w:b/>
+        </w:rPr>
+        <w:t>}</w:t>
       </w:r>
       <w:r>
         <w:rPr>
@@ -108,21 +136,31 @@
         <w:rPr>
           <w:b/>
         </w:rPr>
-        <w:t xml:space="preserve"> автомоб</w:t>
-      </w:r>
+        <w:t xml:space="preserve"> </w:t>
+      </w:r>
+      <w:proofErr w:type="spellStart"/>
       <w:r>
         <w:rPr>
           <w:b/>
+        </w:rPr>
+        <w:t>автомоб</w:t>
+      </w:r>
+      <w:proofErr w:type="spellEnd"/>
+      <w:r>
+        <w:rPr>
+          <w:b/>
           <w:lang w:val="uk-UA"/>
         </w:rPr>
         <w:t>і</w:t>
       </w:r>
+      <w:proofErr w:type="spellStart"/>
       <w:r>
         <w:rPr>
           <w:b/>
         </w:rPr>
         <w:t>льн</w:t>
       </w:r>
+      <w:proofErr w:type="spellEnd"/>
       <w:r>
         <w:rPr>
           <w:b/>
@@ -136,6 +174,7 @@
         </w:rPr>
         <w:t>м транспорт</w:t>
       </w:r>
+      <w:proofErr w:type="spellStart"/>
       <w:r>
         <w:rPr>
           <w:b/>
@@ -143,6 +182,7 @@
         </w:rPr>
         <w:t>ом</w:t>
       </w:r>
+      <w:proofErr w:type="spellEnd"/>
       <w:r>
         <w:rPr>
           <w:b/>
@@ -180,56 +220,9 @@
           <w:sz w:val="22"/>
           <w:szCs w:val="22"/>
         </w:rPr>
-        <w:t>{carrierCompany}</w:t>
-      </w:r>
-      <w:r>
-        <w:rPr>
-          <w:b/>
-          <w:sz w:val="22"/>
-          <w:szCs w:val="22"/>
-          <w:lang w:val="en-US"/>
-        </w:rPr>
-        <w:t xml:space="preserve"> </w:t>
-      </w:r>
-      <w:r>
-        <w:rPr>
-          <w:sz w:val="22"/>
-          <w:szCs w:val="22"/>
-          <w:lang w:val="uk-UA"/>
-        </w:rPr>
-        <w:t xml:space="preserve">в </w:t>
-      </w:r>
-      <w:r>
-        <w:rPr>
-          <w:sz w:val="22"/>
-          <w:szCs w:val="22"/>
-          <w:lang w:val="uk-UA"/>
-        </w:rPr>
-        <w:t xml:space="preserve">особі </w:t>
-      </w:r>
-      <w:r>
-        <w:rPr>
-          <w:sz w:val="22"/>
-          <w:szCs w:val="22"/>
-        </w:rPr>
-        <w:t>{carriersRepresentative}</w:t>
-      </w:r>
-      <w:r>
-        <w:rPr>
-          <w:sz w:val="22"/>
-          <w:szCs w:val="22"/>
-          <w:lang w:val="en-US"/>
-        </w:rPr>
-        <w:t xml:space="preserve"> </w:t>
-      </w:r>
-      <w:r>
-        <w:rPr>
-          <w:sz w:val="22"/>
-          <w:szCs w:val="22"/>
-          <w:lang w:val="uk-UA"/>
-        </w:rPr>
-        <w:t xml:space="preserve">діючого на підставі </w:t>
-      </w:r>
+        <w:t>{</w:t>
+      </w:r>
+      <w:proofErr w:type="spellStart"/>
       <w:r>
         <w:rPr>
           <w:b/>
@@ -237,7 +230,110 @@
           <w:sz w:val="22"/>
           <w:szCs w:val="22"/>
         </w:rPr>
-        <w:t>{basisOfAuthority}</w:t>
+        <w:t>carrierCompany</w:t>
+      </w:r>
+      <w:proofErr w:type="spellEnd"/>
+      <w:r>
+        <w:rPr>
+          <w:b/>
+          <w:bCs/>
+          <w:sz w:val="22"/>
+          <w:szCs w:val="22"/>
+        </w:rPr>
+        <w:t>}</w:t>
+      </w:r>
+      <w:r>
+        <w:rPr>
+          <w:b/>
+          <w:sz w:val="22"/>
+          <w:szCs w:val="22"/>
+          <w:lang w:val="en-US"/>
+        </w:rPr>
+        <w:t xml:space="preserve"> </w:t>
+      </w:r>
+      <w:r>
+        <w:rPr>
+          <w:sz w:val="22"/>
+          <w:szCs w:val="22"/>
+          <w:lang w:val="uk-UA"/>
+        </w:rPr>
+        <w:t xml:space="preserve">в </w:t>
+      </w:r>
+      <w:r>
+        <w:rPr>
+          <w:sz w:val="22"/>
+          <w:szCs w:val="22"/>
+          <w:lang w:val="uk-UA"/>
+        </w:rPr>
+        <w:t xml:space="preserve">особі </w:t>
+      </w:r>
+      <w:r>
+        <w:rPr>
+          <w:sz w:val="22"/>
+          <w:szCs w:val="22"/>
+        </w:rPr>
+        <w:t>{</w:t>
+      </w:r>
+      <w:proofErr w:type="spellStart"/>
+      <w:r>
+        <w:rPr>
+          <w:sz w:val="22"/>
+          <w:szCs w:val="22"/>
+        </w:rPr>
+        <w:t>carriersRepresentative</w:t>
+      </w:r>
+      <w:proofErr w:type="spellEnd"/>
+      <w:r>
+        <w:rPr>
+          <w:sz w:val="22"/>
+          <w:szCs w:val="22"/>
+        </w:rPr>
+        <w:t>}</w:t>
+      </w:r>
+      <w:r>
+        <w:rPr>
+          <w:sz w:val="22"/>
+          <w:szCs w:val="22"/>
+          <w:lang w:val="en-US"/>
+        </w:rPr>
+        <w:t xml:space="preserve"> </w:t>
+      </w:r>
+      <w:r>
+        <w:rPr>
+          <w:sz w:val="22"/>
+          <w:szCs w:val="22"/>
+          <w:lang w:val="uk-UA"/>
+        </w:rPr>
+        <w:t xml:space="preserve">діючого на підставі </w:t>
+      </w:r>
+      <w:r>
+        <w:rPr>
+          <w:b/>
+          <w:bCs/>
+          <w:sz w:val="22"/>
+          <w:szCs w:val="22"/>
+        </w:rPr>
+        <w:t>{</w:t>
+      </w:r>
+      <w:proofErr w:type="spellStart"/>
+      <w:r>
+        <w:rPr>
+          <w:b/>
+          <w:bCs/>
+          <w:sz w:val="22"/>
+          <w:szCs w:val="22"/>
+        </w:rPr>
+        <w:t>basisOfAuthority</w:t>
+      </w:r>
+      <w:proofErr w:type="spellEnd"/>
+      <w:r>
+        <w:rPr>
+          <w:b/>
+          <w:bCs/>
+          <w:sz w:val="22"/>
+          <w:szCs w:val="22"/>
+        </w:rPr>
+        <w:t>}</w:t>
       </w:r>
       <w:r>
         <w:rPr>
@@ -309,8 +405,17 @@
           <w:sz w:val="22"/>
           <w:szCs w:val="22"/>
         </w:rPr>
-        <w:t xml:space="preserve"> друго</w:t>
-      </w:r>
+        <w:t xml:space="preserve"> </w:t>
+      </w:r>
+      <w:proofErr w:type="spellStart"/>
+      <w:r>
+        <w:rPr>
+          <w:sz w:val="22"/>
+          <w:szCs w:val="22"/>
+        </w:rPr>
+        <w:t>друго</w:t>
+      </w:r>
+      <w:proofErr w:type="spellEnd"/>
       <w:r>
         <w:rPr>
           <w:sz w:val="22"/>
@@ -409,12 +514,45 @@
           <w:szCs w:val="22"/>
         </w:rPr>
       </w:pPr>
-      <w:r>
-        <w:rPr>
-          <w:sz w:val="22"/>
-          <w:szCs w:val="22"/>
-        </w:rPr>
-        <w:t>Перевізник приймає на себе зобов</w:t>
+      <w:proofErr w:type="spellStart"/>
+      <w:r>
+        <w:rPr>
+          <w:sz w:val="22"/>
+          <w:szCs w:val="22"/>
+        </w:rPr>
+        <w:t>Перевізник</w:t>
+      </w:r>
+      <w:proofErr w:type="spellEnd"/>
+      <w:r>
+        <w:rPr>
+          <w:sz w:val="22"/>
+          <w:szCs w:val="22"/>
+        </w:rPr>
+        <w:t xml:space="preserve"> </w:t>
+      </w:r>
+      <w:proofErr w:type="spellStart"/>
+      <w:r>
+        <w:rPr>
+          <w:sz w:val="22"/>
+          <w:szCs w:val="22"/>
+        </w:rPr>
+        <w:t>приймає</w:t>
+      </w:r>
+      <w:proofErr w:type="spellEnd"/>
+      <w:r>
+        <w:rPr>
+          <w:sz w:val="22"/>
+          <w:szCs w:val="22"/>
+        </w:rPr>
+        <w:t xml:space="preserve"> на себе </w:t>
+      </w:r>
+      <w:proofErr w:type="spellStart"/>
+      <w:r>
+        <w:rPr>
+          <w:sz w:val="22"/>
+          <w:szCs w:val="22"/>
+        </w:rPr>
+        <w:t>зобов</w:t>
       </w:r>
       <w:r>
         <w:rPr>
@@ -428,15 +566,113 @@
           <w:sz w:val="22"/>
           <w:szCs w:val="22"/>
         </w:rPr>
-        <w:t>язання по перевезенню вантажу, який належить Експедитору, а Експедитор</w:t>
-      </w:r>
-      <w:r>
-        <w:rPr>
-          <w:sz w:val="22"/>
-          <w:szCs w:val="22"/>
-        </w:rPr>
-        <w:t xml:space="preserve"> </w:t>
-      </w:r>
+        <w:t>язання</w:t>
+      </w:r>
+      <w:proofErr w:type="spellEnd"/>
+      <w:r>
+        <w:rPr>
+          <w:sz w:val="22"/>
+          <w:szCs w:val="22"/>
+        </w:rPr>
+        <w:t xml:space="preserve"> по </w:t>
+      </w:r>
+      <w:proofErr w:type="spellStart"/>
+      <w:r>
+        <w:rPr>
+          <w:sz w:val="22"/>
+          <w:szCs w:val="22"/>
+        </w:rPr>
+        <w:t>перевезенню</w:t>
+      </w:r>
+      <w:proofErr w:type="spellEnd"/>
+      <w:r>
+        <w:rPr>
+          <w:sz w:val="22"/>
+          <w:szCs w:val="22"/>
+        </w:rPr>
+        <w:t xml:space="preserve"> </w:t>
+      </w:r>
+      <w:proofErr w:type="spellStart"/>
+      <w:r>
+        <w:rPr>
+          <w:sz w:val="22"/>
+          <w:szCs w:val="22"/>
+        </w:rPr>
+        <w:t>вантажу</w:t>
+      </w:r>
+      <w:proofErr w:type="spellEnd"/>
+      <w:r>
+        <w:rPr>
+          <w:sz w:val="22"/>
+          <w:szCs w:val="22"/>
+        </w:rPr>
+        <w:t xml:space="preserve">, </w:t>
+      </w:r>
+      <w:proofErr w:type="spellStart"/>
+      <w:r>
+        <w:rPr>
+          <w:sz w:val="22"/>
+          <w:szCs w:val="22"/>
+        </w:rPr>
+        <w:t>який</w:t>
+      </w:r>
+      <w:proofErr w:type="spellEnd"/>
+      <w:r>
+        <w:rPr>
+          <w:sz w:val="22"/>
+          <w:szCs w:val="22"/>
+        </w:rPr>
+        <w:t xml:space="preserve"> </w:t>
+      </w:r>
+      <w:proofErr w:type="spellStart"/>
+      <w:r>
+        <w:rPr>
+          <w:sz w:val="22"/>
+          <w:szCs w:val="22"/>
+        </w:rPr>
+        <w:t>належить</w:t>
+      </w:r>
+      <w:proofErr w:type="spellEnd"/>
+      <w:r>
+        <w:rPr>
+          <w:sz w:val="22"/>
+          <w:szCs w:val="22"/>
+        </w:rPr>
+        <w:t xml:space="preserve"> </w:t>
+      </w:r>
+      <w:proofErr w:type="spellStart"/>
+      <w:r>
+        <w:rPr>
+          <w:sz w:val="22"/>
+          <w:szCs w:val="22"/>
+        </w:rPr>
+        <w:t>Експедитору</w:t>
+      </w:r>
+      <w:proofErr w:type="spellEnd"/>
+      <w:r>
+        <w:rPr>
+          <w:sz w:val="22"/>
+          <w:szCs w:val="22"/>
+        </w:rPr>
+        <w:t xml:space="preserve">, а </w:t>
+      </w:r>
+      <w:proofErr w:type="spellStart"/>
+      <w:r>
+        <w:rPr>
+          <w:sz w:val="22"/>
+          <w:szCs w:val="22"/>
+        </w:rPr>
+        <w:t>Експедитор</w:t>
+      </w:r>
+      <w:proofErr w:type="spellEnd"/>
+      <w:r>
+        <w:rPr>
+          <w:sz w:val="22"/>
+          <w:szCs w:val="22"/>
+        </w:rPr>
+        <w:t xml:space="preserve"> </w:t>
+      </w:r>
+      <w:proofErr w:type="spellStart"/>
       <w:r>
         <w:rPr>
           <w:sz w:val="22"/>
@@ -456,7 +692,95 @@
           <w:sz w:val="22"/>
           <w:szCs w:val="22"/>
         </w:rPr>
-        <w:t xml:space="preserve">язується оплатити надані послуги згідно тарифам Перевізника. </w:t>
+        <w:t>язується</w:t>
+      </w:r>
+      <w:proofErr w:type="spellEnd"/>
+      <w:r>
+        <w:rPr>
+          <w:sz w:val="22"/>
+          <w:szCs w:val="22"/>
+        </w:rPr>
+        <w:t xml:space="preserve"> </w:t>
+      </w:r>
+      <w:proofErr w:type="spellStart"/>
+      <w:r>
+        <w:rPr>
+          <w:sz w:val="22"/>
+          <w:szCs w:val="22"/>
+        </w:rPr>
+        <w:t>оплатити</w:t>
+      </w:r>
+      <w:proofErr w:type="spellEnd"/>
+      <w:r>
+        <w:rPr>
+          <w:sz w:val="22"/>
+          <w:szCs w:val="22"/>
+        </w:rPr>
+        <w:t xml:space="preserve"> </w:t>
+      </w:r>
+      <w:proofErr w:type="spellStart"/>
+      <w:r>
+        <w:rPr>
+          <w:sz w:val="22"/>
+          <w:szCs w:val="22"/>
+        </w:rPr>
+        <w:t>надані</w:t>
+      </w:r>
+      <w:proofErr w:type="spellEnd"/>
+      <w:r>
+        <w:rPr>
+          <w:sz w:val="22"/>
+          <w:szCs w:val="22"/>
+        </w:rPr>
+        <w:t xml:space="preserve"> </w:t>
+      </w:r>
+      <w:proofErr w:type="spellStart"/>
+      <w:r>
+        <w:rPr>
+          <w:sz w:val="22"/>
+          <w:szCs w:val="22"/>
+        </w:rPr>
+        <w:t>послуги</w:t>
+      </w:r>
+      <w:proofErr w:type="spellEnd"/>
+      <w:r>
+        <w:rPr>
+          <w:sz w:val="22"/>
+          <w:szCs w:val="22"/>
+        </w:rPr>
+        <w:t xml:space="preserve"> </w:t>
+      </w:r>
+      <w:proofErr w:type="spellStart"/>
+      <w:r>
+        <w:rPr>
+          <w:sz w:val="22"/>
+          <w:szCs w:val="22"/>
+        </w:rPr>
+        <w:t>згідно</w:t>
+      </w:r>
+      <w:proofErr w:type="spellEnd"/>
+      <w:r>
+        <w:rPr>
+          <w:sz w:val="22"/>
+          <w:szCs w:val="22"/>
+        </w:rPr>
+        <w:t xml:space="preserve"> тарифам </w:t>
+      </w:r>
+      <w:proofErr w:type="spellStart"/>
+      <w:r>
+        <w:rPr>
+          <w:sz w:val="22"/>
+          <w:szCs w:val="22"/>
+        </w:rPr>
+        <w:t>Перевізника</w:t>
+      </w:r>
+      <w:proofErr w:type="spellEnd"/>
+      <w:r>
+        <w:rPr>
+          <w:sz w:val="22"/>
+          <w:szCs w:val="22"/>
+        </w:rPr>
+        <w:t xml:space="preserve">. </w:t>
       </w:r>
     </w:p>
     <w:p>
@@ -591,7 +915,23 @@
                 <w:sz w:val="22"/>
                 <w:szCs w:val="22"/>
               </w:rPr>
-              <w:t>{loadingDateAndTime}</w:t>
+              <w:t>{</w:t>
+            </w:r>
+            <w:proofErr w:type="spellStart"/>
+            <w:r>
+              <w:rPr>
+                <w:sz w:val="22"/>
+                <w:szCs w:val="22"/>
+              </w:rPr>
+              <w:t>loadingDateAndTime</w:t>
+            </w:r>
+            <w:proofErr w:type="spellEnd"/>
+            <w:r>
+              <w:rPr>
+                <w:sz w:val="22"/>
+                <w:szCs w:val="22"/>
+              </w:rPr>
+              <w:t>}</w:t>
             </w:r>
           </w:p>
         </w:tc>
@@ -647,8 +987,17 @@
                 <w:sz w:val="22"/>
                 <w:szCs w:val="22"/>
               </w:rPr>
-              <w:t>, контактн</w:t>
-            </w:r>
+              <w:t xml:space="preserve">, </w:t>
+            </w:r>
+            <w:proofErr w:type="spellStart"/>
+            <w:r>
+              <w:rPr>
+                <w:sz w:val="22"/>
+                <w:szCs w:val="22"/>
+              </w:rPr>
+              <w:t>контактн</w:t>
+            </w:r>
+            <w:proofErr w:type="spellEnd"/>
             <w:r>
               <w:rPr>
                 <w:sz w:val="22"/>
@@ -685,7 +1034,25 @@
                 <w:sz w:val="22"/>
                 <w:szCs w:val="22"/>
               </w:rPr>
-              <w:t>{loadingDetails}</w:t>
+              <w:t>{</w:t>
+            </w:r>
+            <w:proofErr w:type="spellStart"/>
+            <w:r>
+              <w:rPr>
+                <w:color w:val="000000"/>
+                <w:sz w:val="22"/>
+                <w:szCs w:val="22"/>
+              </w:rPr>
+              <w:t>loadingDetails</w:t>
+            </w:r>
+            <w:proofErr w:type="spellEnd"/>
+            <w:r>
+              <w:rPr>
+                <w:color w:val="000000"/>
+                <w:sz w:val="22"/>
+                <w:szCs w:val="22"/>
+              </w:rPr>
+              <w:t>}</w:t>
             </w:r>
           </w:p>
         </w:tc>
@@ -726,8 +1093,17 @@
                 <w:sz w:val="22"/>
                 <w:szCs w:val="22"/>
               </w:rPr>
-              <w:t>, контактн</w:t>
-            </w:r>
+              <w:t xml:space="preserve">, </w:t>
+            </w:r>
+            <w:proofErr w:type="spellStart"/>
+            <w:r>
+              <w:rPr>
+                <w:sz w:val="22"/>
+                <w:szCs w:val="22"/>
+              </w:rPr>
+              <w:t>контактн</w:t>
+            </w:r>
+            <w:proofErr w:type="spellEnd"/>
             <w:r>
               <w:rPr>
                 <w:sz w:val="22"/>
@@ -764,7 +1140,25 @@
                 <w:sz w:val="22"/>
                 <w:szCs w:val="22"/>
               </w:rPr>
-              <w:t>{unloadingDetails}</w:t>
+              <w:t>{</w:t>
+            </w:r>
+            <w:proofErr w:type="spellStart"/>
+            <w:r>
+              <w:rPr>
+                <w:color w:val="000000"/>
+                <w:sz w:val="22"/>
+                <w:szCs w:val="22"/>
+              </w:rPr>
+              <w:t>unloadingDetails</w:t>
+            </w:r>
+            <w:proofErr w:type="spellEnd"/>
+            <w:r>
+              <w:rPr>
+                <w:color w:val="000000"/>
+                <w:sz w:val="22"/>
+                <w:szCs w:val="22"/>
+              </w:rPr>
+              <w:t>}</w:t>
             </w:r>
           </w:p>
         </w:tc>
@@ -811,7 +1205,23 @@
                 <w:sz w:val="22"/>
                 <w:szCs w:val="22"/>
               </w:rPr>
-              <w:t>{route}</w:t>
+              <w:t>{</w:t>
+            </w:r>
+            <w:proofErr w:type="spellStart"/>
+            <w:r>
+              <w:rPr>
+                <w:sz w:val="22"/>
+                <w:szCs w:val="22"/>
+              </w:rPr>
+              <w:t>route</w:t>
+            </w:r>
+            <w:proofErr w:type="spellEnd"/>
+            <w:r>
+              <w:rPr>
+                <w:sz w:val="22"/>
+                <w:szCs w:val="22"/>
+              </w:rPr>
+              <w:t>}</w:t>
             </w:r>
           </w:p>
         </w:tc>
@@ -833,6 +1243,7 @@
                 <w:lang w:val="uk-UA"/>
               </w:rPr>
             </w:pPr>
+            <w:proofErr w:type="spellStart"/>
             <w:r>
               <w:rPr>
                 <w:sz w:val="22"/>
@@ -840,6 +1251,7 @@
               </w:rPr>
               <w:t>Опис</w:t>
             </w:r>
+            <w:proofErr w:type="spellEnd"/>
             <w:r>
               <w:rPr>
                 <w:sz w:val="22"/>
@@ -926,7 +1338,23 @@
                 <w:sz w:val="22"/>
                 <w:szCs w:val="22"/>
               </w:rPr>
-              <w:t>{cargoDetails}</w:t>
+              <w:t>{</w:t>
+            </w:r>
+            <w:proofErr w:type="spellStart"/>
+            <w:r>
+              <w:rPr>
+                <w:sz w:val="22"/>
+                <w:szCs w:val="22"/>
+              </w:rPr>
+              <w:t>cargoDetails</w:t>
+            </w:r>
+            <w:proofErr w:type="spellEnd"/>
+            <w:r>
+              <w:rPr>
+                <w:sz w:val="22"/>
+                <w:szCs w:val="22"/>
+              </w:rPr>
+              <w:t>}</w:t>
             </w:r>
           </w:p>
         </w:tc>
@@ -978,6 +1406,7 @@
               </w:rPr>
               <w:t xml:space="preserve">про </w:t>
             </w:r>
+            <w:proofErr w:type="spellStart"/>
             <w:r>
               <w:rPr>
                 <w:sz w:val="20"/>
@@ -993,6 +1422,7 @@
               </w:rPr>
               <w:t>іль</w:t>
             </w:r>
+            <w:proofErr w:type="spellEnd"/>
             <w:r>
               <w:rPr>
                 <w:sz w:val="20"/>
@@ -1029,7 +1459,25 @@
                 <w:szCs w:val="22"/>
                 <w:lang w:eastAsia="en-US"/>
               </w:rPr>
-              <w:t>{vehicleDetails}</w:t>
+              <w:t>{</w:t>
+            </w:r>
+            <w:proofErr w:type="spellStart"/>
+            <w:r>
+              <w:rPr>
+                <w:sz w:val="22"/>
+                <w:szCs w:val="22"/>
+                <w:lang w:eastAsia="en-US"/>
+              </w:rPr>
+              <w:t>vehicleDetails</w:t>
+            </w:r>
+            <w:proofErr w:type="spellEnd"/>
+            <w:r>
+              <w:rPr>
+                <w:sz w:val="22"/>
+                <w:szCs w:val="22"/>
+                <w:lang w:eastAsia="en-US"/>
+              </w:rPr>
+              <w:t>}</w:t>
             </w:r>
           </w:p>
         </w:tc>
@@ -1096,7 +1544,25 @@
                 <w:szCs w:val="22"/>
                 <w:lang w:eastAsia="en-US"/>
               </w:rPr>
-              <w:t>{driverDetails}</w:t>
+              <w:t>{</w:t>
+            </w:r>
+            <w:proofErr w:type="spellStart"/>
+            <w:r>
+              <w:rPr>
+                <w:sz w:val="22"/>
+                <w:szCs w:val="22"/>
+                <w:lang w:eastAsia="en-US"/>
+              </w:rPr>
+              <w:t>driverDetails</w:t>
+            </w:r>
+            <w:proofErr w:type="spellEnd"/>
+            <w:r>
+              <w:rPr>
+                <w:sz w:val="22"/>
+                <w:szCs w:val="22"/>
+                <w:lang w:eastAsia="en-US"/>
+              </w:rPr>
+              <w:t>}</w:t>
             </w:r>
           </w:p>
         </w:tc>
@@ -1156,7 +1622,25 @@
                 <w:szCs w:val="22"/>
                 <w:lang w:eastAsia="en-US"/>
               </w:rPr>
-              <w:t>{driversLicenseDetails}</w:t>
+              <w:t>{</w:t>
+            </w:r>
+            <w:proofErr w:type="spellStart"/>
+            <w:r>
+              <w:rPr>
+                <w:sz w:val="22"/>
+                <w:szCs w:val="22"/>
+                <w:lang w:eastAsia="en-US"/>
+              </w:rPr>
+              <w:t>driversLicenseDetails</w:t>
+            </w:r>
+            <w:proofErr w:type="spellEnd"/>
+            <w:r>
+              <w:rPr>
+                <w:sz w:val="22"/>
+                <w:szCs w:val="22"/>
+                <w:lang w:eastAsia="en-US"/>
+              </w:rPr>
+              <w:t>}</w:t>
             </w:r>
           </w:p>
         </w:tc>
@@ -1175,6 +1659,7 @@
                 <w:lang w:val="en-US"/>
               </w:rPr>
             </w:pPr>
+            <w:proofErr w:type="spellStart"/>
             <w:r>
               <w:rPr>
                 <w:sz w:val="22"/>
@@ -1182,6 +1667,7 @@
               </w:rPr>
               <w:t>Спос</w:t>
             </w:r>
+            <w:proofErr w:type="spellEnd"/>
             <w:r>
               <w:rPr>
                 <w:sz w:val="22"/>
@@ -1238,7 +1724,23 @@
                 <w:sz w:val="22"/>
                 <w:szCs w:val="22"/>
               </w:rPr>
-              <w:t>{loadingUnloadingMethod}</w:t>
+              <w:t>{</w:t>
+            </w:r>
+            <w:proofErr w:type="spellStart"/>
+            <w:r>
+              <w:rPr>
+                <w:sz w:val="22"/>
+                <w:szCs w:val="22"/>
+              </w:rPr>
+              <w:t>loadingUnloadingMethod</w:t>
+            </w:r>
+            <w:proofErr w:type="spellEnd"/>
+            <w:r>
+              <w:rPr>
+                <w:sz w:val="22"/>
+                <w:szCs w:val="22"/>
+              </w:rPr>
+              <w:t>}</w:t>
             </w:r>
           </w:p>
         </w:tc>
@@ -1295,8 +1797,17 @@
                 <w:sz w:val="22"/>
                 <w:szCs w:val="22"/>
               </w:rPr>
-              <w:t xml:space="preserve"> спос</w:t>
-            </w:r>
+              <w:t xml:space="preserve"> </w:t>
+            </w:r>
+            <w:proofErr w:type="spellStart"/>
+            <w:r>
+              <w:rPr>
+                <w:sz w:val="22"/>
+                <w:szCs w:val="22"/>
+              </w:rPr>
+              <w:t>спос</w:t>
+            </w:r>
+            <w:proofErr w:type="spellEnd"/>
             <w:r>
               <w:rPr>
                 <w:sz w:val="22"/>
@@ -1340,7 +1851,23 @@
                 <w:sz w:val="22"/>
                 <w:szCs w:val="22"/>
               </w:rPr>
-              <w:t>{paymentDetails}</w:t>
+              <w:t>{</w:t>
+            </w:r>
+            <w:proofErr w:type="spellStart"/>
+            <w:r>
+              <w:rPr>
+                <w:sz w:val="22"/>
+                <w:szCs w:val="22"/>
+              </w:rPr>
+              <w:t>carrierPaymentDetails</w:t>
+            </w:r>
+            <w:proofErr w:type="spellEnd"/>
+            <w:r>
+              <w:rPr>
+                <w:sz w:val="22"/>
+                <w:szCs w:val="22"/>
+              </w:rPr>
+              <w:t>}</w:t>
             </w:r>
           </w:p>
         </w:tc>
@@ -1419,7 +1946,23 @@
                 <w:sz w:val="22"/>
                 <w:szCs w:val="22"/>
               </w:rPr>
-              <w:t>{deliveryDeadline}</w:t>
+              <w:t>{</w:t>
+            </w:r>
+            <w:proofErr w:type="spellStart"/>
+            <w:r>
+              <w:rPr>
+                <w:sz w:val="22"/>
+                <w:szCs w:val="22"/>
+              </w:rPr>
+              <w:t>deliveryDeadline</w:t>
+            </w:r>
+            <w:proofErr w:type="spellEnd"/>
+            <w:r>
+              <w:rPr>
+                <w:sz w:val="22"/>
+                <w:szCs w:val="22"/>
+              </w:rPr>
+              <w:t>}</w:t>
             </w:r>
           </w:p>
         </w:tc>
@@ -1472,12 +2015,21 @@
               </w:rPr>
               <w:t>{</w:t>
             </w:r>
-            <w:r>
-              <w:rPr>
-                <w:sz w:val="22"/>
-                <w:szCs w:val="22"/>
-              </w:rPr>
-              <w:t>otherDetails}</w:t>
+            <w:proofErr w:type="spellStart"/>
+            <w:r>
+              <w:rPr>
+                <w:sz w:val="22"/>
+                <w:szCs w:val="22"/>
+              </w:rPr>
+              <w:t>otherDetails</w:t>
+            </w:r>
+            <w:proofErr w:type="spellEnd"/>
+            <w:r>
+              <w:rPr>
+                <w:sz w:val="22"/>
+                <w:szCs w:val="22"/>
+              </w:rPr>
+              <w:t>}</w:t>
             </w:r>
           </w:p>
         </w:tc>
@@ -1500,6 +2052,7 @@
         </w:rPr>
         <w:t>1. Дан</w:t>
       </w:r>
+      <w:proofErr w:type="spellStart"/>
       <w:r>
         <w:rPr>
           <w:i/>
@@ -1509,6 +2062,7 @@
         </w:rPr>
         <w:t>ий</w:t>
       </w:r>
+      <w:proofErr w:type="spellEnd"/>
       <w:r>
         <w:rPr>
           <w:i/>
@@ -1543,6 +2097,7 @@
         </w:rPr>
         <w:t>є одно</w:t>
       </w:r>
+      <w:proofErr w:type="spellStart"/>
       <w:r>
         <w:rPr>
           <w:i/>
@@ -1551,6 +2106,7 @@
         </w:rPr>
         <w:t>разов</w:t>
       </w:r>
+      <w:proofErr w:type="spellEnd"/>
       <w:r>
         <w:rPr>
           <w:i/>
@@ -1602,6 +2158,7 @@
         </w:rPr>
         <w:t xml:space="preserve"> по</w:t>
       </w:r>
+      <w:proofErr w:type="spellStart"/>
       <w:r>
         <w:rPr>
           <w:i/>
@@ -1611,14 +2168,25 @@
         </w:rPr>
         <w:t>вну</w:t>
       </w:r>
-      <w:r>
-        <w:rPr>
-          <w:i/>
-          <w:sz w:val="20"/>
-          <w:szCs w:val="20"/>
-        </w:rPr>
-        <w:t xml:space="preserve"> юридич</w:t>
-      </w:r>
+      <w:proofErr w:type="spellEnd"/>
+      <w:r>
+        <w:rPr>
+          <w:i/>
+          <w:sz w:val="20"/>
+          <w:szCs w:val="20"/>
+        </w:rPr>
+        <w:t xml:space="preserve"> </w:t>
+      </w:r>
+      <w:proofErr w:type="spellStart"/>
+      <w:r>
+        <w:rPr>
+          <w:i/>
+          <w:sz w:val="20"/>
+          <w:szCs w:val="20"/>
+        </w:rPr>
+        <w:t>юридич</w:t>
+      </w:r>
+      <w:proofErr w:type="spellEnd"/>
       <w:r>
         <w:rPr>
           <w:i/>
@@ -1683,6 +2251,7 @@
         </w:rPr>
         <w:t>і</w:t>
       </w:r>
+      <w:proofErr w:type="spellStart"/>
       <w:r>
         <w:rPr>
           <w:i/>
@@ -1700,6 +2269,7 @@
         </w:rPr>
         <w:t>джує</w:t>
       </w:r>
+      <w:proofErr w:type="spellEnd"/>
       <w:r>
         <w:rPr>
           <w:i/>
@@ -1757,8 +2327,18 @@
           <w:sz w:val="20"/>
           <w:szCs w:val="20"/>
         </w:rPr>
-        <w:t>, категорич</w:t>
-      </w:r>
+        <w:t xml:space="preserve">, </w:t>
+      </w:r>
+      <w:proofErr w:type="spellStart"/>
+      <w:r>
+        <w:rPr>
+          <w:i/>
+          <w:sz w:val="20"/>
+          <w:szCs w:val="20"/>
+        </w:rPr>
+        <w:t>категорич</w:t>
+      </w:r>
+      <w:proofErr w:type="spellEnd"/>
       <w:r>
         <w:rPr>
           <w:i/>
@@ -1776,14 +2356,25 @@
         </w:rPr>
         <w:t xml:space="preserve"> за</w:t>
       </w:r>
-      <w:r>
-        <w:rPr>
-          <w:i/>
-          <w:sz w:val="20"/>
-          <w:szCs w:val="20"/>
-          <w:lang w:val="uk-UA"/>
-        </w:rPr>
-        <w:t>боронені до перевезення</w:t>
+      <w:proofErr w:type="spellStart"/>
+      <w:r>
+        <w:rPr>
+          <w:i/>
+          <w:sz w:val="20"/>
+          <w:szCs w:val="20"/>
+          <w:lang w:val="uk-UA"/>
+        </w:rPr>
+        <w:t>боронені</w:t>
+      </w:r>
+      <w:proofErr w:type="spellEnd"/>
+      <w:r>
+        <w:rPr>
+          <w:i/>
+          <w:sz w:val="20"/>
+          <w:szCs w:val="20"/>
+          <w:lang w:val="uk-UA"/>
+        </w:rPr>
+        <w:t xml:space="preserve"> до перевезення</w:t>
       </w:r>
       <w:r>
         <w:rPr>
@@ -2014,6 +2605,7 @@
         </w:rPr>
         <w:t>, а так</w:t>
       </w:r>
+      <w:proofErr w:type="spellStart"/>
       <w:r>
         <w:rPr>
           <w:i/>
@@ -2023,6 +2615,7 @@
         </w:rPr>
         <w:t>ож</w:t>
       </w:r>
+      <w:proofErr w:type="spellEnd"/>
       <w:r>
         <w:rPr>
           <w:i/>
@@ -2048,14 +2641,25 @@
         </w:rPr>
         <w:t xml:space="preserve"> за</w:t>
       </w:r>
-      <w:r>
-        <w:rPr>
-          <w:i/>
-          <w:sz w:val="20"/>
-          <w:szCs w:val="20"/>
-          <w:lang w:val="uk-UA"/>
-        </w:rPr>
-        <w:t>боронені до</w:t>
+      <w:proofErr w:type="spellStart"/>
+      <w:r>
+        <w:rPr>
+          <w:i/>
+          <w:sz w:val="20"/>
+          <w:szCs w:val="20"/>
+          <w:lang w:val="uk-UA"/>
+        </w:rPr>
+        <w:t>боронені</w:t>
+      </w:r>
+      <w:proofErr w:type="spellEnd"/>
+      <w:r>
+        <w:rPr>
+          <w:i/>
+          <w:sz w:val="20"/>
+          <w:szCs w:val="20"/>
+          <w:lang w:val="uk-UA"/>
+        </w:rPr>
+        <w:t xml:space="preserve"> до</w:t>
       </w:r>
       <w:r>
         <w:rPr>
@@ -2065,6 +2669,7 @@
         </w:rPr>
         <w:t xml:space="preserve"> перев</w:t>
       </w:r>
+      <w:proofErr w:type="spellStart"/>
       <w:r>
         <w:rPr>
           <w:i/>
@@ -2074,6 +2679,7 @@
         </w:rPr>
         <w:t>езення</w:t>
       </w:r>
+      <w:proofErr w:type="spellEnd"/>
       <w:r>
         <w:rPr>
           <w:i/>
@@ -2166,8 +2772,18 @@
           <w:sz w:val="20"/>
           <w:szCs w:val="20"/>
         </w:rPr>
-        <w:t xml:space="preserve"> необход</w:t>
-      </w:r>
+        <w:t xml:space="preserve"> </w:t>
+      </w:r>
+      <w:proofErr w:type="spellStart"/>
+      <w:r>
+        <w:rPr>
+          <w:i/>
+          <w:sz w:val="20"/>
+          <w:szCs w:val="20"/>
+        </w:rPr>
+        <w:t>необход</w:t>
+      </w:r>
+      <w:proofErr w:type="spellEnd"/>
       <w:r>
         <w:rPr>
           <w:i/>
@@ -2257,16 +2873,46 @@
           <w:szCs w:val="20"/>
           <w:lang w:val="uk-UA"/>
         </w:rPr>
-        <w:t>забезпечити під’їздні шляхи і за</w:t>
-      </w:r>
-      <w:r>
-        <w:rPr>
-          <w:i/>
-          <w:sz w:val="20"/>
-          <w:szCs w:val="20"/>
-        </w:rPr>
-        <w:t xml:space="preserve"> необх</w:t>
-      </w:r>
+        <w:t xml:space="preserve">забезпечити </w:t>
+      </w:r>
+      <w:proofErr w:type="spellStart"/>
+      <w:r>
+        <w:rPr>
+          <w:i/>
+          <w:sz w:val="20"/>
+          <w:szCs w:val="20"/>
+          <w:lang w:val="uk-UA"/>
+        </w:rPr>
+        <w:t>під’їздні</w:t>
+      </w:r>
+      <w:proofErr w:type="spellEnd"/>
+      <w:r>
+        <w:rPr>
+          <w:i/>
+          <w:sz w:val="20"/>
+          <w:szCs w:val="20"/>
+          <w:lang w:val="uk-UA"/>
+        </w:rPr>
+        <w:t xml:space="preserve"> шляхи і за</w:t>
+      </w:r>
+      <w:r>
+        <w:rPr>
+          <w:i/>
+          <w:sz w:val="20"/>
+          <w:szCs w:val="20"/>
+        </w:rPr>
+        <w:t xml:space="preserve"> </w:t>
+      </w:r>
+      <w:proofErr w:type="spellStart"/>
+      <w:r>
+        <w:rPr>
+          <w:i/>
+          <w:sz w:val="20"/>
+          <w:szCs w:val="20"/>
+        </w:rPr>
+        <w:t>необх</w:t>
+      </w:r>
+      <w:proofErr w:type="spellEnd"/>
       <w:r>
         <w:rPr>
           <w:i/>
@@ -2284,6 +2930,7 @@
         </w:rPr>
         <w:t>д</w:t>
       </w:r>
+      <w:proofErr w:type="spellStart"/>
       <w:r>
         <w:rPr>
           <w:i/>
@@ -2293,6 +2940,7 @@
         </w:rPr>
         <w:t>ності</w:t>
       </w:r>
+      <w:proofErr w:type="spellEnd"/>
       <w:r>
         <w:rPr>
           <w:i/>
@@ -2316,7 +2964,35 @@
           <w:sz w:val="20"/>
           <w:szCs w:val="20"/>
         </w:rPr>
-        <w:t xml:space="preserve"> платну  стоянку.</w:t>
+        <w:t xml:space="preserve"> </w:t>
+      </w:r>
+      <w:proofErr w:type="spellStart"/>
+      <w:proofErr w:type="gramStart"/>
+      <w:r>
+        <w:rPr>
+          <w:i/>
+          <w:sz w:val="20"/>
+          <w:szCs w:val="20"/>
+        </w:rPr>
+        <w:t>платну</w:t>
+      </w:r>
+      <w:proofErr w:type="spellEnd"/>
+      <w:r>
+        <w:rPr>
+          <w:i/>
+          <w:sz w:val="20"/>
+          <w:szCs w:val="20"/>
+        </w:rPr>
+        <w:t xml:space="preserve">  стоянку</w:t>
+      </w:r>
+      <w:proofErr w:type="gramEnd"/>
+      <w:r>
+        <w:rPr>
+          <w:i/>
+          <w:sz w:val="20"/>
+          <w:szCs w:val="20"/>
+        </w:rPr>
+        <w:t>.</w:t>
       </w:r>
     </w:p>
     <w:p>
@@ -2393,7 +3069,25 @@
           <w:sz w:val="20"/>
           <w:szCs w:val="20"/>
         </w:rPr>
-        <w:t>{cmrCount}</w:t>
+        <w:t>{</w:t>
+      </w:r>
+      <w:proofErr w:type="spellStart"/>
+      <w:r>
+        <w:rPr>
+          <w:i/>
+          <w:sz w:val="20"/>
+          <w:szCs w:val="20"/>
+        </w:rPr>
+        <w:t>cmrCount</w:t>
+      </w:r>
+      <w:proofErr w:type="spellEnd"/>
+      <w:r>
+        <w:rPr>
+          <w:i/>
+          <w:sz w:val="20"/>
+          <w:szCs w:val="20"/>
+        </w:rPr>
+        <w:t>}</w:t>
       </w:r>
       <w:r>
         <w:rPr>
@@ -2412,13 +3106,59 @@
         </w:rPr>
         <w:t>е</w:t>
       </w:r>
-      <w:r>
-        <w:rPr>
-          <w:i/>
-          <w:sz w:val="20"/>
-          <w:szCs w:val="20"/>
-        </w:rPr>
-        <w:t xml:space="preserve">кземплярах товарно-транспортну накладну </w:t>
+      <w:proofErr w:type="spellStart"/>
+      <w:r>
+        <w:rPr>
+          <w:i/>
+          <w:sz w:val="20"/>
+          <w:szCs w:val="20"/>
+        </w:rPr>
+        <w:t>кземплярах</w:t>
+      </w:r>
+      <w:proofErr w:type="spellEnd"/>
+      <w:r>
+        <w:rPr>
+          <w:i/>
+          <w:sz w:val="20"/>
+          <w:szCs w:val="20"/>
+        </w:rPr>
+        <w:t xml:space="preserve"> товарно-</w:t>
+      </w:r>
+      <w:proofErr w:type="spellStart"/>
+      <w:r>
+        <w:rPr>
+          <w:i/>
+          <w:sz w:val="20"/>
+          <w:szCs w:val="20"/>
+        </w:rPr>
+        <w:t>транспортну</w:t>
+      </w:r>
+      <w:proofErr w:type="spellEnd"/>
+      <w:r>
+        <w:rPr>
+          <w:i/>
+          <w:sz w:val="20"/>
+          <w:szCs w:val="20"/>
+        </w:rPr>
+        <w:t xml:space="preserve"> </w:t>
+      </w:r>
+      <w:proofErr w:type="spellStart"/>
+      <w:r>
+        <w:rPr>
+          <w:i/>
+          <w:sz w:val="20"/>
+          <w:szCs w:val="20"/>
+        </w:rPr>
+        <w:t>накладну</w:t>
+      </w:r>
+      <w:proofErr w:type="spellEnd"/>
+      <w:r>
+        <w:rPr>
+          <w:i/>
+          <w:sz w:val="20"/>
+          <w:szCs w:val="20"/>
+        </w:rPr>
+        <w:t xml:space="preserve"> </w:t>
       </w:r>
       <w:r>
         <w:rPr>
@@ -2454,6 +3194,7 @@
         </w:rPr>
         <w:t>, а так</w:t>
       </w:r>
+      <w:proofErr w:type="spellStart"/>
       <w:r>
         <w:rPr>
           <w:i/>
@@ -2463,6 +3204,7 @@
         </w:rPr>
         <w:t>ож</w:t>
       </w:r>
+      <w:proofErr w:type="spellEnd"/>
       <w:r>
         <w:rPr>
           <w:i/>
@@ -2486,8 +3228,18 @@
           <w:sz w:val="20"/>
           <w:szCs w:val="20"/>
         </w:rPr>
-        <w:t>в, необх</w:t>
-      </w:r>
+        <w:t xml:space="preserve">в, </w:t>
+      </w:r>
+      <w:proofErr w:type="spellStart"/>
+      <w:r>
+        <w:rPr>
+          <w:i/>
+          <w:sz w:val="20"/>
+          <w:szCs w:val="20"/>
+        </w:rPr>
+        <w:t>необх</w:t>
+      </w:r>
+      <w:proofErr w:type="spellEnd"/>
       <w:r>
         <w:rPr>
           <w:i/>
@@ -2522,6 +3274,7 @@
         </w:rPr>
         <w:t xml:space="preserve"> для перев</w:t>
       </w:r>
+      <w:proofErr w:type="spellStart"/>
       <w:r>
         <w:rPr>
           <w:i/>
@@ -2531,6 +3284,7 @@
         </w:rPr>
         <w:t>езення</w:t>
       </w:r>
+      <w:proofErr w:type="spellEnd"/>
       <w:r>
         <w:rPr>
           <w:i/>
@@ -2574,14 +3328,25 @@
         </w:rPr>
         <w:t xml:space="preserve">5. </w:t>
       </w:r>
-      <w:r>
-        <w:rPr>
-          <w:i/>
-          <w:sz w:val="20"/>
-          <w:szCs w:val="20"/>
-          <w:lang w:val="uk-UA"/>
-        </w:rPr>
-        <w:t>Навантажувально-розвантажувальні роботи</w:t>
+      <w:proofErr w:type="spellStart"/>
+      <w:r>
+        <w:rPr>
+          <w:i/>
+          <w:sz w:val="20"/>
+          <w:szCs w:val="20"/>
+          <w:lang w:val="uk-UA"/>
+        </w:rPr>
+        <w:t>Навантажувально</w:t>
+      </w:r>
+      <w:proofErr w:type="spellEnd"/>
+      <w:r>
+        <w:rPr>
+          <w:i/>
+          <w:sz w:val="20"/>
+          <w:szCs w:val="20"/>
+          <w:lang w:val="uk-UA"/>
+        </w:rPr>
+        <w:t>-розвантажувальні роботи</w:t>
       </w:r>
       <w:r>
         <w:rPr>
@@ -2751,7 +3516,17 @@
           <w:szCs w:val="20"/>
           <w:lang w:val="uk-UA"/>
         </w:rPr>
-        <w:t>зобов’язаний проі</w:t>
+        <w:t xml:space="preserve">зобов’язаний </w:t>
+      </w:r>
+      <w:proofErr w:type="spellStart"/>
+      <w:r>
+        <w:rPr>
+          <w:i/>
+          <w:sz w:val="20"/>
+          <w:szCs w:val="20"/>
+          <w:lang w:val="uk-UA"/>
+        </w:rPr>
+        <w:t>проі</w:t>
       </w:r>
       <w:r>
         <w:rPr>
@@ -2761,6 +3536,7 @@
         </w:rPr>
         <w:t>нформ</w:t>
       </w:r>
+      <w:proofErr w:type="spellEnd"/>
       <w:r>
         <w:rPr>
           <w:i/>
@@ -2861,7 +3637,16 @@
           <w:sz w:val="20"/>
           <w:szCs w:val="20"/>
         </w:rPr>
-        <w:t xml:space="preserve"> переадре</w:t>
+        <w:t xml:space="preserve"> </w:t>
+      </w:r>
+      <w:proofErr w:type="spellStart"/>
+      <w:r>
+        <w:rPr>
+          <w:i/>
+          <w:sz w:val="20"/>
+          <w:szCs w:val="20"/>
+        </w:rPr>
+        <w:t>переадре</w:t>
       </w:r>
       <w:r>
         <w:rPr>
@@ -2872,6 +3657,7 @@
         </w:rPr>
         <w:t>сування</w:t>
       </w:r>
+      <w:proofErr w:type="spellEnd"/>
       <w:r>
         <w:rPr>
           <w:i/>
@@ -2997,8 +3783,18 @@
           <w:sz w:val="20"/>
           <w:szCs w:val="20"/>
         </w:rPr>
-        <w:t xml:space="preserve"> за собо</w:t>
-      </w:r>
+        <w:t xml:space="preserve"> за </w:t>
+      </w:r>
+      <w:proofErr w:type="spellStart"/>
+      <w:r>
+        <w:rPr>
+          <w:i/>
+          <w:sz w:val="20"/>
+          <w:szCs w:val="20"/>
+        </w:rPr>
+        <w:t>собо</w:t>
+      </w:r>
+      <w:proofErr w:type="spellEnd"/>
       <w:r>
         <w:rPr>
           <w:i/>
@@ -3084,6 +3880,8 @@
           <w:szCs w:val="22"/>
         </w:rPr>
       </w:pPr>
+      <w:proofErr w:type="spellStart"/>
+      <w:proofErr w:type="gramStart"/>
       <w:r>
         <w:rPr>
           <w:b/>
@@ -3092,6 +3890,7 @@
         </w:rPr>
         <w:t>Рекв</w:t>
       </w:r>
+      <w:proofErr w:type="spellEnd"/>
       <w:r>
         <w:rPr>
           <w:b/>
@@ -3101,6 +3900,7 @@
         </w:rPr>
         <w:t>і</w:t>
       </w:r>
+      <w:proofErr w:type="spellStart"/>
       <w:r>
         <w:rPr>
           <w:b/>
@@ -3109,6 +3909,7 @@
         </w:rPr>
         <w:t>зит</w:t>
       </w:r>
+      <w:proofErr w:type="spellEnd"/>
       <w:r>
         <w:rPr>
           <w:b/>
@@ -3143,6 +3944,7 @@
         </w:rPr>
         <w:t>і</w:t>
       </w:r>
+      <w:proofErr w:type="gramEnd"/>
       <w:r>
         <w:rPr>
           <w:b/>
@@ -3160,14 +3962,34 @@
         </w:rPr>
         <w:t>і</w:t>
       </w:r>
+      <w:proofErr w:type="spellStart"/>
       <w:r>
         <w:rPr>
           <w:b/>
           <w:sz w:val="22"/>
           <w:szCs w:val="22"/>
         </w:rPr>
-        <w:t>дписи стор</w:t>
-      </w:r>
+        <w:t>дписи</w:t>
+      </w:r>
+      <w:proofErr w:type="spellEnd"/>
+      <w:r>
+        <w:rPr>
+          <w:b/>
+          <w:sz w:val="22"/>
+          <w:szCs w:val="22"/>
+        </w:rPr>
+        <w:t xml:space="preserve"> </w:t>
+      </w:r>
+      <w:proofErr w:type="spellStart"/>
+      <w:r>
+        <w:rPr>
+          <w:b/>
+          <w:sz w:val="22"/>
+          <w:szCs w:val="22"/>
+        </w:rPr>
+        <w:t>стор</w:t>
+      </w:r>
+      <w:proofErr w:type="spellEnd"/>
       <w:r>
         <w:rPr>
           <w:b/>
@@ -3218,8 +4040,8 @@
         <w:tblLook w:val="04A0" w:firstRow="1" w:lastRow="0" w:firstColumn="1" w:lastColumn="0" w:noHBand="0" w:noVBand="1"/>
       </w:tblPr>
       <w:tblGrid>
-        <w:gridCol w:w="5394"/>
-        <w:gridCol w:w="5425"/>
+        <w:gridCol w:w="5397"/>
+        <w:gridCol w:w="5422"/>
       </w:tblGrid>
       <w:tr>
         <w:trPr>
@@ -3248,8 +4070,9 @@
                 <w:sz w:val="16"/>
                 <w:szCs w:val="16"/>
               </w:rPr>
-              <w:t>{bankDetailsTitle}</w:t>
-            </w:r>
+              <w:t>{</w:t>
+            </w:r>
+            <w:proofErr w:type="spellStart"/>
             <w:r>
               <w:rPr>
                 <w:rFonts w:ascii="Roboto" w:hAnsi="Roboto"/>
@@ -3257,6 +4080,25 @@
                 <w:sz w:val="16"/>
                 <w:szCs w:val="16"/>
               </w:rPr>
+              <w:t>carrierBankDetailsTitle</w:t>
+            </w:r>
+            <w:proofErr w:type="spellEnd"/>
+            <w:r>
+              <w:rPr>
+                <w:rFonts w:ascii="Roboto" w:hAnsi="Roboto"/>
+                <w:b/>
+                <w:sz w:val="16"/>
+                <w:szCs w:val="16"/>
+              </w:rPr>
+              <w:t>}</w:t>
+            </w:r>
+            <w:r>
+              <w:rPr>
+                <w:rFonts w:ascii="Roboto" w:hAnsi="Roboto"/>
+                <w:b/>
+                <w:sz w:val="16"/>
+                <w:szCs w:val="16"/>
+              </w:rPr>
               <w:br/>
             </w:r>
             <w:r>
@@ -3266,7 +4108,27 @@
                 <w:sz w:val="16"/>
                 <w:szCs w:val="16"/>
               </w:rPr>
-              <w:t>{bankDetailsText}</w:t>
+              <w:t>{</w:t>
+            </w:r>
+            <w:proofErr w:type="spellStart"/>
+            <w:r>
+              <w:rPr>
+                <w:rFonts w:ascii="Roboto" w:hAnsi="Roboto"/>
+                <w:bCs/>
+                <w:sz w:val="16"/>
+                <w:szCs w:val="16"/>
+              </w:rPr>
+              <w:t>carrierBankDetailsTitle</w:t>
+            </w:r>
+            <w:proofErr w:type="spellEnd"/>
+            <w:r>
+              <w:rPr>
+                <w:rFonts w:ascii="Roboto" w:hAnsi="Roboto"/>
+                <w:bCs/>
+                <w:sz w:val="16"/>
+                <w:szCs w:val="16"/>
+              </w:rPr>
+              <w:t>}</w:t>
             </w:r>
             <w:r>
               <w:rPr>
@@ -3314,7 +4176,29 @@
                 <w:szCs w:val="16"/>
                 <w:lang w:eastAsia="uk-UA"/>
               </w:rPr>
-              <w:t>ФОП Дорош Ігор Григорович</w:t>
+              <w:t xml:space="preserve">ФОП Дорош </w:t>
+            </w:r>
+            <w:proofErr w:type="spellStart"/>
+            <w:r>
+              <w:rPr>
+                <w:rFonts w:ascii="Roboto" w:hAnsi="Roboto"/>
+                <w:b/>
+                <w:sz w:val="16"/>
+                <w:szCs w:val="16"/>
+                <w:lang w:eastAsia="uk-UA"/>
+              </w:rPr>
+              <w:t>Ігор</w:t>
+            </w:r>
+            <w:proofErr w:type="spellEnd"/>
+            <w:r>
+              <w:rPr>
+                <w:rFonts w:ascii="Roboto" w:hAnsi="Roboto"/>
+                <w:b/>
+                <w:sz w:val="16"/>
+                <w:szCs w:val="16"/>
+                <w:lang w:eastAsia="uk-UA"/>
+              </w:rPr>
+              <w:t xml:space="preserve"> Григорович</w:t>
             </w:r>
           </w:p>
           <w:p>
@@ -3383,7 +4267,27 @@
                 <w:szCs w:val="16"/>
                 <w:lang w:val="uk-UA" w:eastAsia="uk-UA"/>
               </w:rPr>
-              <w:t>Зборівський район,с. Присівці</w:t>
+              <w:t xml:space="preserve">Зборівський </w:t>
+            </w:r>
+            <w:proofErr w:type="spellStart"/>
+            <w:r>
+              <w:rPr>
+                <w:rFonts w:ascii="Roboto" w:hAnsi="Roboto"/>
+                <w:sz w:val="16"/>
+                <w:szCs w:val="16"/>
+                <w:lang w:val="uk-UA" w:eastAsia="uk-UA"/>
+              </w:rPr>
+              <w:t>район,с</w:t>
+            </w:r>
+            <w:proofErr w:type="spellEnd"/>
+            <w:r>
+              <w:rPr>
+                <w:rFonts w:ascii="Roboto" w:hAnsi="Roboto"/>
+                <w:sz w:val="16"/>
+                <w:szCs w:val="16"/>
+                <w:lang w:val="uk-UA" w:eastAsia="uk-UA"/>
+              </w:rPr>
+              <w:t>. Присівці</w:t>
             </w:r>
           </w:p>
           <w:p>
@@ -3481,6 +4385,7 @@
                 <w:lang w:val="uk-UA" w:eastAsia="uk-UA"/>
               </w:rPr>
             </w:pPr>
+            <w:proofErr w:type="gramStart"/>
             <w:r>
               <w:rPr>
                 <w:rFonts w:ascii="Roboto" w:hAnsi="Roboto"/>
@@ -3497,7 +4402,17 @@
                 <w:szCs w:val="16"/>
                 <w:lang w:val="uk-UA" w:eastAsia="uk-UA"/>
               </w:rPr>
-              <w:t>«Універсал банк» МФО 322001</w:t>
+              <w:t>«</w:t>
+            </w:r>
+            <w:proofErr w:type="gramEnd"/>
+            <w:r>
+              <w:rPr>
+                <w:rFonts w:ascii="Roboto" w:hAnsi="Roboto"/>
+                <w:sz w:val="16"/>
+                <w:szCs w:val="16"/>
+                <w:lang w:val="uk-UA" w:eastAsia="uk-UA"/>
+              </w:rPr>
+              <w:t>Універсал банк» МФО 322001</w:t>
             </w:r>
           </w:p>
           <w:p>
@@ -3640,7 +4555,25 @@
                 <w:sz w:val="16"/>
                 <w:szCs w:val="16"/>
               </w:rPr>
-              <w:t>{carrierSignatureName}</w:t>
+              <w:t>{</w:t>
+            </w:r>
+            <w:proofErr w:type="spellStart"/>
+            <w:r>
+              <w:rPr>
+                <w:bCs/>
+                <w:sz w:val="16"/>
+                <w:szCs w:val="16"/>
+              </w:rPr>
+              <w:t>carrierSignatureName</w:t>
+            </w:r>
+            <w:proofErr w:type="spellEnd"/>
+            <w:r>
+              <w:rPr>
+                <w:bCs/>
+                <w:sz w:val="16"/>
+                <w:szCs w:val="16"/>
+              </w:rPr>
+              <w:t>}</w:t>
             </w:r>
           </w:p>
           <w:p>
@@ -4299,7 +5232,6 @@
   <w:style w:type="character" w:default="1" w:styleId="DefaultParagraphFont">
     <w:name w:val="Default Paragraph Font"/>
     <w:uiPriority w:val="1"/>
-    <w:semiHidden/>
     <w:unhideWhenUsed/>
   </w:style>
   <w:style w:type="table" w:default="1" w:styleId="TableNormal">

</xml_diff>